<commit_message>
fix tables in docx files
</commit_message>
<xml_diff>
--- a/твт_статья_АСПО/article.docx
+++ b/твт_статья_АСПО/article.docx
@@ -9121,7 +9121,7 @@
       <w:tblPr>
         <w:tblStyle w:val="Table"/>
         <w:tblW w:type="pct" w:w="5000"/>
-        <w:tblLayout w:type="fixed"/>
+        <w:tblLayout w:type="autofit"/>
         <w:tblLook w:firstRow="1" w:lastRow="0" w:firstColumn="0" w:lastColumn="0" w:noHBand="0" w:noVBand="0" w:val="0020"/>
       </w:tblPr>
       <w:tblGrid>
@@ -10357,7 +10357,7 @@
       <w:tblPr>
         <w:tblStyle w:val="Table"/>
         <w:tblW w:type="pct" w:w="5000"/>
-        <w:tblLayout w:type="fixed"/>
+        <w:tblLayout w:type="autofit"/>
         <w:tblLook w:firstRow="1" w:lastRow="0" w:firstColumn="0" w:lastColumn="0" w:noHBand="0" w:noVBand="0" w:val="0020"/>
       </w:tblPr>
       <w:tblGrid>
@@ -12089,7 +12089,7 @@
       <w:tblPr>
         <w:tblStyle w:val="Table"/>
         <w:tblW w:type="pct" w:w="5000"/>
-        <w:tblLayout w:type="fixed"/>
+        <w:tblLayout w:type="autofit"/>
         <w:tblLook w:firstRow="1" w:lastRow="0" w:firstColumn="0" w:lastColumn="0" w:noHBand="0" w:noVBand="0" w:val="0020"/>
       </w:tblPr>
       <w:tblGrid>
@@ -14254,6 +14254,7 @@
     <w:qFormat/>
     <w:pPr>
       <w:spacing w:after="36" w:before="36"/>
+      <w:ind w:firstLine="0"/>
     </w:pPr>
   </w:style>
   <w:style w:styleId="Title" w:type="paragraph">

</xml_diff>